<commit_message>
week 5 updated tut
</commit_message>
<xml_diff>
--- a/topic05-persistence-xml-exceptions/unit-05b-labs/tutorial-1-crud/archives/05.Tutorial-5-1.docx
+++ b/topic05-persistence-xml-exceptions/unit-05b-labs/tutorial-1-crud/archives/05.Tutorial-5-1.docx
@@ -55,7 +55,7 @@
     <w:p>
       <w:r>
         <w:pict w14:anchorId="5C01D3C2">
-          <v:rect id="_x0000_i1103" style="width:0;height:1.5pt" o:hralign="center" o:hrstd="t" o:hr="t" fillcolor="#a0a0a0" stroked="f"/>
+          <v:rect id="_x0000_i1025" style="width:0;height:1.5pt" o:hralign="center" o:hrstd="t" o:hr="t" fillcolor="#a0a0a0" stroked="f"/>
         </w:pict>
       </w:r>
     </w:p>
@@ -130,7 +130,7 @@
     <w:p>
       <w:r>
         <w:pict w14:anchorId="4D259470">
-          <v:rect id="_x0000_i1104" style="width:0;height:1.5pt" o:hralign="center" o:hrstd="t" o:hr="t" fillcolor="#a0a0a0" stroked="f"/>
+          <v:rect id="_x0000_i1026" style="width:0;height:1.5pt" o:hralign="center" o:hrstd="t" o:hr="t" fillcolor="#a0a0a0" stroked="f"/>
         </w:pict>
       </w:r>
     </w:p>
@@ -226,7 +226,7 @@
     <w:p>
       <w:r>
         <w:pict w14:anchorId="35BC7A29">
-          <v:rect id="_x0000_i1105" style="width:0;height:1.5pt" o:hralign="center" o:hrstd="t" o:hr="t" fillcolor="#a0a0a0" stroked="f"/>
+          <v:rect id="_x0000_i1027" style="width:0;height:1.5pt" o:hralign="center" o:hrstd="t" o:hr="t" fillcolor="#a0a0a0" stroked="f"/>
         </w:pict>
       </w:r>
     </w:p>
@@ -297,7 +297,7 @@
       <w:r>
         <w:lastRenderedPageBreak/>
         <w:pict w14:anchorId="1AA738D6">
-          <v:rect id="_x0000_i1106" style="width:0;height:1.5pt" o:hralign="center" o:hrstd="t" o:hr="t" fillcolor="#a0a0a0" stroked="f"/>
+          <v:rect id="_x0000_i1028" style="width:0;height:1.5pt" o:hralign="center" o:hrstd="t" o:hr="t" fillcolor="#a0a0a0" stroked="f"/>
         </w:pict>
       </w:r>
     </w:p>
@@ -357,7 +357,7 @@
     <w:p>
       <w:r>
         <w:pict w14:anchorId="1C3C173A">
-          <v:rect id="_x0000_i1107" style="width:0;height:1.5pt" o:hralign="center" o:hrstd="t" o:hr="t" fillcolor="#a0a0a0" stroked="f"/>
+          <v:rect id="_x0000_i1029" style="width:0;height:1.5pt" o:hralign="center" o:hrstd="t" o:hr="t" fillcolor="#a0a0a0" stroked="f"/>
         </w:pict>
       </w:r>
     </w:p>
@@ -376,14 +376,7 @@
           <w:b/>
           <w:bCs/>
         </w:rPr>
-        <w:t xml:space="preserve">5. </w:t>
-      </w:r>
-      <w:r>
-        <w:rPr>
-          <w:b/>
-          <w:bCs/>
-        </w:rPr>
-        <w:t>Handling Multiple Exceptions in One Try Block</w:t>
+        <w:t>5. Handling Multiple Exceptions in One Try Block</w:t>
       </w:r>
     </w:p>
     <w:p>
@@ -556,7 +549,7 @@
     <w:p>
       <w:r>
         <w:pict w14:anchorId="4853C95D">
-          <v:rect id="_x0000_i1108" style="width:0;height:1.5pt" o:hralign="center" o:hrstd="t" o:hr="t" fillcolor="#a0a0a0" stroked="f"/>
+          <v:rect id="_x0000_i1030" style="width:0;height:1.5pt" o:hralign="center" o:hrstd="t" o:hr="t" fillcolor="#a0a0a0" stroked="f"/>
         </w:pict>
       </w:r>
     </w:p>
@@ -633,7 +626,7 @@
     <w:p>
       <w:r>
         <w:pict w14:anchorId="5160BE97">
-          <v:rect id="_x0000_i1109" style="width:0;height:1.5pt" o:hralign="center" o:hrstd="t" o:hr="t" fillcolor="#a0a0a0" stroked="f"/>
+          <v:rect id="_x0000_i1031" style="width:0;height:1.5pt" o:hralign="center" o:hrstd="t" o:hr="t" fillcolor="#a0a0a0" stroked="f"/>
         </w:pict>
       </w:r>
     </w:p>
@@ -689,7 +682,7 @@
     <w:p>
       <w:r>
         <w:pict w14:anchorId="077C7D7A">
-          <v:rect id="_x0000_i1110" style="width:0;height:1.5pt" o:hralign="center" o:hrstd="t" o:hr="t" fillcolor="#a0a0a0" stroked="f"/>
+          <v:rect id="_x0000_i1032" style="width:0;height:1.5pt" o:hralign="center" o:hrstd="t" o:hr="t" fillcolor="#a0a0a0" stroked="f"/>
         </w:pict>
       </w:r>
     </w:p>
@@ -769,7 +762,7 @@
     <w:p>
       <w:r>
         <w:pict w14:anchorId="4DE663E5">
-          <v:rect id="_x0000_i1111" style="width:0;height:1.5pt" o:hralign="center" o:hrstd="t" o:hr="t" fillcolor="#a0a0a0" stroked="f"/>
+          <v:rect id="_x0000_i1033" style="width:0;height:1.5pt" o:hralign="center" o:hrstd="t" o:hr="t" fillcolor="#a0a0a0" stroked="f"/>
         </w:pict>
       </w:r>
     </w:p>
@@ -862,7 +855,7 @@
     <w:p>
       <w:r>
         <w:pict w14:anchorId="1A933956">
-          <v:rect id="_x0000_i1112" style="width:0;height:1.5pt" o:hralign="center" o:hrstd="t" o:hr="t" fillcolor="#a0a0a0" stroked="f"/>
+          <v:rect id="_x0000_i1034" style="width:0;height:1.5pt" o:hralign="center" o:hrstd="t" o:hr="t" fillcolor="#a0a0a0" stroked="f"/>
         </w:pict>
       </w:r>
     </w:p>
@@ -929,7 +922,7 @@
     <w:p>
       <w:r>
         <w:pict w14:anchorId="1D0B565C">
-          <v:rect id="_x0000_i1113" style="width:0;height:1.5pt" o:hralign="center" o:hrstd="t" o:hr="t" fillcolor="#a0a0a0" stroked="f"/>
+          <v:rect id="_x0000_i1035" style="width:0;height:1.5pt" o:hralign="center" o:hrstd="t" o:hr="t" fillcolor="#a0a0a0" stroked="f"/>
         </w:pict>
       </w:r>
     </w:p>
@@ -978,7 +971,7 @@
     <w:p>
       <w:r>
         <w:pict w14:anchorId="56FCD126">
-          <v:rect id="_x0000_i1114" style="width:0;height:1.5pt" o:hralign="center" o:hrstd="t" o:hr="t" fillcolor="#a0a0a0" stroked="f"/>
+          <v:rect id="_x0000_i1036" style="width:0;height:1.5pt" o:hralign="center" o:hrstd="t" o:hr="t" fillcolor="#a0a0a0" stroked="f"/>
         </w:pict>
       </w:r>
     </w:p>
@@ -995,7 +988,332 @@
           <w:bCs/>
         </w:rPr>
         <w:lastRenderedPageBreak/>
-        <w:t>12. Thinking Challenge</w:t>
+        <w:t xml:space="preserve">12. Using </w:t>
+      </w:r>
+      <w:proofErr w:type="spellStart"/>
+      <w:r>
+        <w:rPr>
+          <w:b/>
+          <w:bCs/>
+        </w:rPr>
+        <w:t>t</w:t>
+      </w:r>
+      <w:r>
+        <w:rPr>
+          <w:b/>
+          <w:bCs/>
+        </w:rPr>
+        <w:t>ry..catch</w:t>
+      </w:r>
+      <w:proofErr w:type="spellEnd"/>
+    </w:p>
+    <w:p>
+      <w:r>
+        <w:t>The following method is written in Store.</w:t>
+      </w:r>
+    </w:p>
+    <w:p>
+      <w:r>
+        <w:rPr>
+          <w:noProof/>
+        </w:rPr>
+        <mc:AlternateContent>
+          <mc:Choice Requires="wps">
+            <w:drawing>
+              <wp:anchor distT="0" distB="0" distL="114300" distR="114300" simplePos="0" relativeHeight="251660288" behindDoc="0" locked="0" layoutInCell="1" allowOverlap="1" wp14:anchorId="2CB778E7" wp14:editId="5C4B52AA">
+                <wp:simplePos x="0" y="0"/>
+                <wp:positionH relativeFrom="column">
+                  <wp:posOffset>1485900</wp:posOffset>
+                </wp:positionH>
+                <wp:positionV relativeFrom="paragraph">
+                  <wp:posOffset>379095</wp:posOffset>
+                </wp:positionV>
+                <wp:extent cx="1950720" cy="68580"/>
+                <wp:effectExtent l="0" t="0" r="11430" b="26670"/>
+                <wp:wrapNone/>
+                <wp:docPr id="1688796022" name="Rectangle 1"/>
+                <wp:cNvGraphicFramePr/>
+                <a:graphic xmlns:a="http://schemas.openxmlformats.org/drawingml/2006/main">
+                  <a:graphicData uri="http://schemas.microsoft.com/office/word/2010/wordprocessingShape">
+                    <wps:wsp>
+                      <wps:cNvSpPr/>
+                      <wps:spPr>
+                        <a:xfrm>
+                          <a:off x="0" y="0"/>
+                          <a:ext cx="1950720" cy="68580"/>
+                        </a:xfrm>
+                        <a:prstGeom prst="rect">
+                          <a:avLst/>
+                        </a:prstGeom>
+                        <a:solidFill>
+                          <a:schemeClr val="bg1"/>
+                        </a:solidFill>
+                        <a:ln>
+                          <a:solidFill>
+                            <a:schemeClr val="bg1"/>
+                          </a:solidFill>
+                        </a:ln>
+                      </wps:spPr>
+                      <wps:style>
+                        <a:lnRef idx="2">
+                          <a:schemeClr val="accent1">
+                            <a:shade val="15000"/>
+                          </a:schemeClr>
+                        </a:lnRef>
+                        <a:fillRef idx="1">
+                          <a:schemeClr val="accent1"/>
+                        </a:fillRef>
+                        <a:effectRef idx="0">
+                          <a:schemeClr val="accent1"/>
+                        </a:effectRef>
+                        <a:fontRef idx="minor">
+                          <a:schemeClr val="lt1"/>
+                        </a:fontRef>
+                      </wps:style>
+                      <wps:bodyPr rot="0" spcFirstLastPara="0" vertOverflow="overflow" horzOverflow="overflow" vert="horz" wrap="square" lIns="91440" tIns="45720" rIns="91440" bIns="45720" numCol="1" spcCol="0" rtlCol="0" fromWordArt="0" anchor="ctr" anchorCtr="0" forceAA="0" compatLnSpc="1">
+                        <a:prstTxWarp prst="textNoShape">
+                          <a:avLst/>
+                        </a:prstTxWarp>
+                        <a:noAutofit/>
+                      </wps:bodyPr>
+                    </wps:wsp>
+                  </a:graphicData>
+                </a:graphic>
+              </wp:anchor>
+            </w:drawing>
+          </mc:Choice>
+          <mc:Fallback>
+            <w:pict>
+              <v:rect w14:anchorId="5B475BDA" id="Rectangle 1" o:spid="_x0000_s1026" style="position:absolute;margin-left:117pt;margin-top:29.85pt;width:153.6pt;height:5.4pt;z-index:251660288;visibility:visible;mso-wrap-style:square;mso-wrap-distance-left:9pt;mso-wrap-distance-top:0;mso-wrap-distance-right:9pt;mso-wrap-distance-bottom:0;mso-position-horizontal:absolute;mso-position-horizontal-relative:text;mso-position-vertical:absolute;mso-position-vertical-relative:text;v-text-anchor:middle" o:gfxdata="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" fillcolor="white [3212]" strokecolor="white [3212]" strokeweight="1.5pt"/>
+            </w:pict>
+          </mc:Fallback>
+        </mc:AlternateContent>
+      </w:r>
+      <w:r>
+        <w:drawing>
+          <wp:inline distT="0" distB="0" distL="0" distR="0" wp14:anchorId="180B9784" wp14:editId="4C786F02">
+            <wp:extent cx="5731510" cy="1616075"/>
+            <wp:effectExtent l="0" t="0" r="2540" b="3175"/>
+            <wp:docPr id="2130338013" name="Picture 1"/>
+            <wp:cNvGraphicFramePr>
+              <a:graphicFrameLocks xmlns:a="http://schemas.openxmlformats.org/drawingml/2006/main" noChangeAspect="1"/>
+            </wp:cNvGraphicFramePr>
+            <a:graphic xmlns:a="http://schemas.openxmlformats.org/drawingml/2006/main">
+              <a:graphicData uri="http://schemas.openxmlformats.org/drawingml/2006/picture">
+                <pic:pic xmlns:pic="http://schemas.openxmlformats.org/drawingml/2006/picture">
+                  <pic:nvPicPr>
+                    <pic:cNvPr id="2130338013" name=""/>
+                    <pic:cNvPicPr/>
+                  </pic:nvPicPr>
+                  <pic:blipFill>
+                    <a:blip r:embed="rId8"/>
+                    <a:stretch>
+                      <a:fillRect/>
+                    </a:stretch>
+                  </pic:blipFill>
+                  <pic:spPr>
+                    <a:xfrm>
+                      <a:off x="0" y="0"/>
+                      <a:ext cx="5731510" cy="1616075"/>
+                    </a:xfrm>
+                    <a:prstGeom prst="rect">
+                      <a:avLst/>
+                    </a:prstGeom>
+                  </pic:spPr>
+                </pic:pic>
+              </a:graphicData>
+            </a:graphic>
+          </wp:inline>
+        </w:drawing>
+      </w:r>
+    </w:p>
+    <w:p>
+      <w:r>
+        <w:t>The following code is going to call it, but has an error.</w:t>
+      </w:r>
+    </w:p>
+    <w:p>
+      <w:r>
+        <w:rPr>
+          <w:noProof/>
+        </w:rPr>
+        <mc:AlternateContent>
+          <mc:Choice Requires="wps">
+            <w:drawing>
+              <wp:anchor distT="0" distB="0" distL="114300" distR="114300" simplePos="0" relativeHeight="251662336" behindDoc="0" locked="0" layoutInCell="1" allowOverlap="1" wp14:anchorId="5E4F0241" wp14:editId="1F747BEA">
+                <wp:simplePos x="0" y="0"/>
+                <wp:positionH relativeFrom="column">
+                  <wp:posOffset>228600</wp:posOffset>
+                </wp:positionH>
+                <wp:positionV relativeFrom="paragraph">
+                  <wp:posOffset>693420</wp:posOffset>
+                </wp:positionV>
+                <wp:extent cx="1950720" cy="68580"/>
+                <wp:effectExtent l="0" t="0" r="11430" b="26670"/>
+                <wp:wrapNone/>
+                <wp:docPr id="1024752263" name="Rectangle 1"/>
+                <wp:cNvGraphicFramePr/>
+                <a:graphic xmlns:a="http://schemas.openxmlformats.org/drawingml/2006/main">
+                  <a:graphicData uri="http://schemas.microsoft.com/office/word/2010/wordprocessingShape">
+                    <wps:wsp>
+                      <wps:cNvSpPr/>
+                      <wps:spPr>
+                        <a:xfrm>
+                          <a:off x="0" y="0"/>
+                          <a:ext cx="1950720" cy="68580"/>
+                        </a:xfrm>
+                        <a:prstGeom prst="rect">
+                          <a:avLst/>
+                        </a:prstGeom>
+                        <a:solidFill>
+                          <a:schemeClr val="bg1"/>
+                        </a:solidFill>
+                        <a:ln>
+                          <a:solidFill>
+                            <a:schemeClr val="bg1"/>
+                          </a:solidFill>
+                        </a:ln>
+                      </wps:spPr>
+                      <wps:style>
+                        <a:lnRef idx="2">
+                          <a:schemeClr val="accent1">
+                            <a:shade val="15000"/>
+                          </a:schemeClr>
+                        </a:lnRef>
+                        <a:fillRef idx="1">
+                          <a:schemeClr val="accent1"/>
+                        </a:fillRef>
+                        <a:effectRef idx="0">
+                          <a:schemeClr val="accent1"/>
+                        </a:effectRef>
+                        <a:fontRef idx="minor">
+                          <a:schemeClr val="lt1"/>
+                        </a:fontRef>
+                      </wps:style>
+                      <wps:bodyPr rot="0" spcFirstLastPara="0" vertOverflow="overflow" horzOverflow="overflow" vert="horz" wrap="square" lIns="91440" tIns="45720" rIns="91440" bIns="45720" numCol="1" spcCol="0" rtlCol="0" fromWordArt="0" anchor="ctr" anchorCtr="0" forceAA="0" compatLnSpc="1">
+                        <a:prstTxWarp prst="textNoShape">
+                          <a:avLst/>
+                        </a:prstTxWarp>
+                        <a:noAutofit/>
+                      </wps:bodyPr>
+                    </wps:wsp>
+                  </a:graphicData>
+                </a:graphic>
+              </wp:anchor>
+            </w:drawing>
+          </mc:Choice>
+          <mc:Fallback>
+            <w:pict>
+              <v:rect w14:anchorId="1D361A6F" id="Rectangle 1" o:spid="_x0000_s1026" style="position:absolute;margin-left:18pt;margin-top:54.6pt;width:153.6pt;height:5.4pt;z-index:251662336;visibility:visible;mso-wrap-style:square;mso-wrap-distance-left:9pt;mso-wrap-distance-top:0;mso-wrap-distance-right:9pt;mso-wrap-distance-bottom:0;mso-position-horizontal:absolute;mso-position-horizontal-relative:text;mso-position-vertical:absolute;mso-position-vertical-relative:text;v-text-anchor:middle" o:gfxdata="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" fillcolor="white [3212]" strokecolor="white [3212]" strokeweight="1.5pt"/>
+            </w:pict>
+          </mc:Fallback>
+        </mc:AlternateContent>
+      </w:r>
+      <w:r>
+        <w:drawing>
+          <wp:inline distT="0" distB="0" distL="0" distR="0" wp14:anchorId="35BD8DA2" wp14:editId="5C756EFF">
+            <wp:extent cx="3436619" cy="1261402"/>
+            <wp:effectExtent l="0" t="0" r="0" b="0"/>
+            <wp:docPr id="1848048567" name="Picture 1"/>
+            <wp:cNvGraphicFramePr>
+              <a:graphicFrameLocks xmlns:a="http://schemas.openxmlformats.org/drawingml/2006/main" noChangeAspect="1"/>
+            </wp:cNvGraphicFramePr>
+            <a:graphic xmlns:a="http://schemas.openxmlformats.org/drawingml/2006/main">
+              <a:graphicData uri="http://schemas.openxmlformats.org/drawingml/2006/picture">
+                <pic:pic xmlns:pic="http://schemas.openxmlformats.org/drawingml/2006/picture">
+                  <pic:nvPicPr>
+                    <pic:cNvPr id="1848048567" name=""/>
+                    <pic:cNvPicPr/>
+                  </pic:nvPicPr>
+                  <pic:blipFill>
+                    <a:blip r:embed="rId9"/>
+                    <a:stretch>
+                      <a:fillRect/>
+                    </a:stretch>
+                  </pic:blipFill>
+                  <pic:spPr>
+                    <a:xfrm>
+                      <a:off x="0" y="0"/>
+                      <a:ext cx="3456904" cy="1268848"/>
+                    </a:xfrm>
+                    <a:prstGeom prst="rect">
+                      <a:avLst/>
+                    </a:prstGeom>
+                  </pic:spPr>
+                </pic:pic>
+              </a:graphicData>
+            </a:graphic>
+          </wp:inline>
+        </w:drawing>
+      </w:r>
+    </w:p>
+    <w:p>
+      <w:pPr>
+        <w:pStyle w:val="ListParagraph"/>
+        <w:numPr>
+          <w:ilvl w:val="0"/>
+          <w:numId w:val="13"/>
+        </w:numPr>
+      </w:pPr>
+      <w:r>
+        <w:t>What is the error?</w:t>
+      </w:r>
+    </w:p>
+    <w:p>
+      <w:pPr>
+        <w:pStyle w:val="ListParagraph"/>
+        <w:numPr>
+          <w:ilvl w:val="0"/>
+          <w:numId w:val="13"/>
+        </w:numPr>
+      </w:pPr>
+      <w:r>
+        <w:t>Rewrite the code correctly.</w:t>
+      </w:r>
+    </w:p>
+    <w:p>
+      <w:pPr>
+        <w:rPr>
+          <w:b/>
+          <w:bCs/>
+        </w:rPr>
+      </w:pPr>
+      <w:r>
+        <w:rPr>
+          <w:b/>
+          <w:bCs/>
+        </w:rPr>
+        <w:br w:type="page"/>
+      </w:r>
+    </w:p>
+    <w:p>
+      <w:pPr>
+        <w:rPr>
+          <w:b/>
+          <w:bCs/>
+        </w:rPr>
+      </w:pPr>
+      <w:r>
+        <w:rPr>
+          <w:b/>
+          <w:bCs/>
+        </w:rPr>
+        <w:lastRenderedPageBreak/>
+        <w:t>1</w:t>
+      </w:r>
+      <w:r>
+        <w:rPr>
+          <w:b/>
+          <w:bCs/>
+        </w:rPr>
+        <w:t>3</w:t>
+      </w:r>
+      <w:r>
+        <w:rPr>
+          <w:b/>
+          <w:bCs/>
+        </w:rPr>
+        <w:t>. Thinking Challenge</w:t>
       </w:r>
     </w:p>
     <w:p>
@@ -1038,11 +1356,985 @@
     <w:p>
       <w:r>
         <w:pict w14:anchorId="3BF094D1">
-          <v:rect id="_x0000_i1115" style="width:0;height:1.5pt" o:hralign="center" o:hrstd="t" o:hr="t" fillcolor="#a0a0a0" stroked="f"/>
+          <v:rect id="_x0000_i1037" style="width:0;height:1.5pt" o:hralign="center" o:hrstd="t" o:hr="t" fillcolor="#a0a0a0" stroked="f"/>
         </w:pict>
       </w:r>
     </w:p>
-    <w:p/>
+    <w:p>
+      <w:r>
+        <w:rPr>
+          <w:b/>
+          <w:bCs/>
+        </w:rPr>
+        <mc:AlternateContent>
+          <mc:Choice Requires="wps">
+            <w:drawing>
+              <wp:anchor distT="0" distB="0" distL="114300" distR="114300" simplePos="0" relativeHeight="251659264" behindDoc="0" locked="0" layoutInCell="1" allowOverlap="1" wp14:anchorId="7CA880FE" wp14:editId="169258D1">
+                <wp:simplePos x="0" y="0"/>
+                <wp:positionH relativeFrom="column">
+                  <wp:posOffset>396240</wp:posOffset>
+                </wp:positionH>
+                <wp:positionV relativeFrom="paragraph">
+                  <wp:posOffset>162560</wp:posOffset>
+                </wp:positionV>
+                <wp:extent cx="8682570" cy="2031325"/>
+                <wp:effectExtent l="0" t="0" r="26670" b="26670"/>
+                <wp:wrapNone/>
+                <wp:docPr id="3" name="Rectangle 1">
+                  <a:extLst xmlns:a="http://schemas.openxmlformats.org/drawingml/2006/main">
+                    <a:ext uri="{FF2B5EF4-FFF2-40B4-BE49-F238E27FC236}">
+                      <a16:creationId xmlns:a16="http://schemas.microsoft.com/office/drawing/2014/main" id="{5E829D51-B376-4662-9C8C-7EB7CC48E24B}"/>
+                    </a:ext>
+                  </a:extLst>
+                </wp:docPr>
+                <wp:cNvGraphicFramePr>
+                  <a:graphicFrameLocks xmlns:a="http://schemas.openxmlformats.org/drawingml/2006/main"/>
+                </wp:cNvGraphicFramePr>
+                <a:graphic xmlns:a="http://schemas.openxmlformats.org/drawingml/2006/main">
+                  <a:graphicData uri="http://schemas.microsoft.com/office/word/2010/wordprocessingShape">
+                    <wps:wsp>
+                      <wps:cNvSpPr>
+                        <a:spLocks noChangeArrowheads="1"/>
+                      </wps:cNvSpPr>
+                      <wps:spPr bwMode="auto">
+                        <a:xfrm>
+                          <a:off x="0" y="0"/>
+                          <a:ext cx="8682570" cy="2031325"/>
+                        </a:xfrm>
+                        <a:prstGeom prst="rect">
+                          <a:avLst/>
+                        </a:prstGeom>
+                        <a:ln/>
+                      </wps:spPr>
+                      <wps:style>
+                        <a:lnRef idx="2">
+                          <a:schemeClr val="accent1"/>
+                        </a:lnRef>
+                        <a:fillRef idx="1">
+                          <a:schemeClr val="lt1"/>
+                        </a:fillRef>
+                        <a:effectRef idx="0">
+                          <a:schemeClr val="accent1"/>
+                        </a:effectRef>
+                        <a:fontRef idx="minor">
+                          <a:schemeClr val="dk1"/>
+                        </a:fontRef>
+                      </wps:style>
+                      <wps:txbx>
+                        <w:txbxContent>
+                          <w:p>
+                            <w:pPr>
+                              <w:kinsoku w:val="0"/>
+                              <w:overflowPunct w:val="0"/>
+                              <w:textAlignment w:val="baseline"/>
+                              <w:rPr>
+                                <w:rFonts w:ascii="JetBrains Mono" w:hAnsi="JetBrains Mono"/>
+                                <w:color w:val="0033B3"/>
+                                <w:kern w:val="24"/>
+                                <w:sz w:val="36"/>
+                                <w:szCs w:val="36"/>
+                                <w:lang/>
+                                <w14:ligatures w14:val="none"/>
+                              </w:rPr>
+                            </w:pPr>
+                            <w:r>
+                              <w:rPr>
+                                <w:rFonts w:ascii="JetBrains Mono" w:hAnsi="JetBrains Mono"/>
+                                <w:color w:val="0033B3"/>
+                                <w:kern w:val="24"/>
+                                <w:sz w:val="36"/>
+                                <w:szCs w:val="36"/>
+                                <w:lang/>
+                              </w:rPr>
+                              <w:t xml:space="preserve">public void </w:t>
+                            </w:r>
+                            <w:r>
+                              <w:rPr>
+                                <w:rFonts w:ascii="JetBrains Mono" w:hAnsi="JetBrains Mono"/>
+                                <w:color w:val="00627A"/>
+                                <w:kern w:val="24"/>
+                                <w:sz w:val="36"/>
+                                <w:szCs w:val="36"/>
+                                <w:lang/>
+                              </w:rPr>
+                              <w:t>save</w:t>
+                            </w:r>
+                            <w:r>
+                              <w:rPr>
+                                <w:rFonts w:ascii="JetBrains Mono" w:hAnsi="JetBrains Mono"/>
+                                <w:color w:val="080808"/>
+                                <w:kern w:val="24"/>
+                                <w:sz w:val="36"/>
+                                <w:szCs w:val="36"/>
+                                <w:lang/>
+                              </w:rPr>
+                              <w:t xml:space="preserve">() </w:t>
+                            </w:r>
+                            <w:r>
+                              <w:rPr>
+                                <w:rFonts w:ascii="JetBrains Mono" w:hAnsi="JetBrains Mono"/>
+                                <w:color w:val="0033B3"/>
+                                <w:kern w:val="24"/>
+                                <w:sz w:val="36"/>
+                                <w:szCs w:val="36"/>
+                                <w:lang/>
+                              </w:rPr>
+                              <w:t xml:space="preserve">throws </w:t>
+                            </w:r>
+                            <w:r>
+                              <w:rPr>
+                                <w:rFonts w:ascii="JetBrains Mono" w:hAnsi="JetBrains Mono"/>
+                                <w:color w:val="000000"/>
+                                <w:kern w:val="24"/>
+                                <w:sz w:val="36"/>
+                                <w:szCs w:val="36"/>
+                                <w:lang/>
+                              </w:rPr>
+                              <w:t xml:space="preserve">Exception </w:t>
+                            </w:r>
+                            <w:r>
+                              <w:rPr>
+                                <w:rFonts w:ascii="JetBrains Mono" w:hAnsi="JetBrains Mono"/>
+                                <w:color w:val="080808"/>
+                                <w:kern w:val="24"/>
+                                <w:sz w:val="36"/>
+                                <w:szCs w:val="36"/>
+                                <w:lang/>
+                              </w:rPr>
+                              <w:t>{</w:t>
+                            </w:r>
+                            <w:r>
+                              <w:rPr>
+                                <w:rFonts w:ascii="JetBrains Mono" w:hAnsi="JetBrains Mono"/>
+                                <w:color w:val="080808"/>
+                                <w:kern w:val="24"/>
+                                <w:sz w:val="36"/>
+                                <w:szCs w:val="36"/>
+                                <w:lang/>
+                              </w:rPr>
+                              <w:br/>
+                              <w:t xml:space="preserve">    </w:t>
+                            </w:r>
+                            <w:r>
+                              <w:rPr>
+                                <w:rFonts w:ascii="JetBrains Mono" w:hAnsi="JetBrains Mono"/>
+                                <w:color w:val="000000"/>
+                                <w:kern w:val="24"/>
+                                <w:sz w:val="36"/>
+                                <w:szCs w:val="36"/>
+                                <w:lang/>
+                              </w:rPr>
+                              <w:t xml:space="preserve">XStream xstream </w:t>
+                            </w:r>
+                            <w:r>
+                              <w:rPr>
+                                <w:rFonts w:ascii="JetBrains Mono" w:hAnsi="JetBrains Mono"/>
+                                <w:color w:val="080808"/>
+                                <w:kern w:val="24"/>
+                                <w:sz w:val="36"/>
+                                <w:szCs w:val="36"/>
+                                <w:lang/>
+                              </w:rPr>
+                              <w:t xml:space="preserve">= </w:t>
+                            </w:r>
+                            <w:r>
+                              <w:rPr>
+                                <w:rFonts w:ascii="JetBrains Mono" w:hAnsi="JetBrains Mono"/>
+                                <w:color w:val="0033B3"/>
+                                <w:kern w:val="24"/>
+                                <w:sz w:val="36"/>
+                                <w:szCs w:val="36"/>
+                                <w:lang/>
+                              </w:rPr>
+                              <w:t xml:space="preserve">new </w:t>
+                            </w:r>
+                            <w:r>
+                              <w:rPr>
+                                <w:rFonts w:ascii="JetBrains Mono" w:hAnsi="JetBrains Mono"/>
+                                <w:color w:val="080808"/>
+                                <w:kern w:val="24"/>
+                                <w:sz w:val="36"/>
+                                <w:szCs w:val="36"/>
+                                <w:lang/>
+                              </w:rPr>
+                              <w:t>XStream(</w:t>
+                            </w:r>
+                            <w:r>
+                              <w:rPr>
+                                <w:rFonts w:ascii="JetBrains Mono" w:hAnsi="JetBrains Mono"/>
+                                <w:color w:val="0033B3"/>
+                                <w:kern w:val="24"/>
+                                <w:sz w:val="36"/>
+                                <w:szCs w:val="36"/>
+                                <w:lang/>
+                              </w:rPr>
+                              <w:t xml:space="preserve">new </w:t>
+                            </w:r>
+                            <w:r>
+                              <w:rPr>
+                                <w:rFonts w:ascii="JetBrains Mono" w:hAnsi="JetBrains Mono"/>
+                                <w:color w:val="080808"/>
+                                <w:kern w:val="24"/>
+                                <w:sz w:val="36"/>
+                                <w:szCs w:val="36"/>
+                                <w:lang/>
+                              </w:rPr>
+                              <w:t>DomDriver());</w:t>
+                            </w:r>
+                            <w:r>
+                              <w:rPr>
+                                <w:rFonts w:ascii="JetBrains Mono" w:hAnsi="JetBrains Mono"/>
+                                <w:color w:val="080808"/>
+                                <w:kern w:val="24"/>
+                                <w:sz w:val="36"/>
+                                <w:szCs w:val="36"/>
+                                <w:lang w:val="en-GB"/>
+                              </w:rPr>
+                              <w:t xml:space="preserve">    </w:t>
+                            </w:r>
+                            <w:r>
+                              <w:rPr>
+                                <w:rFonts w:ascii="JetBrains Mono" w:hAnsi="JetBrains Mono"/>
+                                <w:color w:val="080808"/>
+                                <w:kern w:val="24"/>
+                                <w:sz w:val="36"/>
+                                <w:szCs w:val="36"/>
+                                <w:lang/>
+                              </w:rPr>
+                              <w:br/>
+                              <w:t xml:space="preserve">    </w:t>
+                            </w:r>
+                            <w:r>
+                              <w:rPr>
+                                <w:rFonts w:ascii="JetBrains Mono" w:hAnsi="JetBrains Mono"/>
+                                <w:color w:val="000000"/>
+                                <w:kern w:val="24"/>
+                                <w:sz w:val="36"/>
+                                <w:szCs w:val="36"/>
+                                <w:lang/>
+                              </w:rPr>
+                              <w:t xml:space="preserve">ObjectOutputStream out </w:t>
+                            </w:r>
+                            <w:r>
+                              <w:rPr>
+                                <w:rFonts w:ascii="JetBrains Mono" w:hAnsi="JetBrains Mono"/>
+                                <w:color w:val="080808"/>
+                                <w:kern w:val="24"/>
+                                <w:sz w:val="36"/>
+                                <w:szCs w:val="36"/>
+                                <w:lang/>
+                              </w:rPr>
+                              <w:t xml:space="preserve">= </w:t>
+                            </w:r>
+                          </w:p>
+                          <w:p>
+                            <w:pPr>
+                              <w:kinsoku w:val="0"/>
+                              <w:overflowPunct w:val="0"/>
+                              <w:textAlignment w:val="baseline"/>
+                              <w:rPr>
+                                <w:rFonts w:ascii="JetBrains Mono" w:hAnsi="JetBrains Mono"/>
+                                <w:color w:val="080808"/>
+                                <w:kern w:val="24"/>
+                                <w:sz w:val="36"/>
+                                <w:szCs w:val="36"/>
+                                <w:lang w:val="en-GB"/>
+                              </w:rPr>
+                            </w:pPr>
+                            <w:r>
+                              <w:rPr>
+                                <w:rFonts w:ascii="JetBrains Mono" w:hAnsi="JetBrains Mono"/>
+                                <w:color w:val="080808"/>
+                                <w:kern w:val="24"/>
+                                <w:sz w:val="36"/>
+                                <w:szCs w:val="36"/>
+                                <w:lang w:val="en-GB"/>
+                              </w:rPr>
+                              <w:tab/>
+                            </w:r>
+                            <w:r>
+                              <w:rPr>
+                                <w:rFonts w:ascii="JetBrains Mono" w:hAnsi="JetBrains Mono"/>
+                                <w:color w:val="080808"/>
+                                <w:kern w:val="24"/>
+                                <w:sz w:val="36"/>
+                                <w:szCs w:val="36"/>
+                                <w:lang w:val="en-GB"/>
+                              </w:rPr>
+                              <w:tab/>
+                            </w:r>
+                            <w:r>
+                              <w:rPr>
+                                <w:rFonts w:ascii="JetBrains Mono" w:hAnsi="JetBrains Mono"/>
+                                <w:color w:val="000000"/>
+                                <w:kern w:val="24"/>
+                                <w:sz w:val="36"/>
+                                <w:szCs w:val="36"/>
+                                <w:lang/>
+                              </w:rPr>
+                              <w:t>xstream</w:t>
+                            </w:r>
+                            <w:r>
+                              <w:rPr>
+                                <w:rFonts w:ascii="JetBrains Mono" w:hAnsi="JetBrains Mono"/>
+                                <w:color w:val="080808"/>
+                                <w:kern w:val="24"/>
+                                <w:sz w:val="36"/>
+                                <w:szCs w:val="36"/>
+                                <w:lang/>
+                              </w:rPr>
+                              <w:t>.createObjectOutputStream(</w:t>
+                            </w:r>
+                            <w:r>
+                              <w:rPr>
+                                <w:rFonts w:ascii="JetBrains Mono" w:hAnsi="JetBrains Mono"/>
+                                <w:color w:val="0033B3"/>
+                                <w:kern w:val="24"/>
+                                <w:sz w:val="36"/>
+                                <w:szCs w:val="36"/>
+                                <w:lang/>
+                              </w:rPr>
+                              <w:t xml:space="preserve">new </w:t>
+                            </w:r>
+                            <w:r>
+                              <w:rPr>
+                                <w:rFonts w:ascii="JetBrains Mono" w:hAnsi="JetBrains Mono"/>
+                                <w:color w:val="080808"/>
+                                <w:kern w:val="24"/>
+                                <w:sz w:val="36"/>
+                                <w:szCs w:val="36"/>
+                                <w:lang/>
+                              </w:rPr>
+                              <w:t>FileWriter(</w:t>
+                            </w:r>
+                            <w:r>
+                              <w:rPr>
+                                <w:rFonts w:ascii="JetBrains Mono" w:hAnsi="JetBrains Mono"/>
+                                <w:color w:val="067D17"/>
+                                <w:kern w:val="24"/>
+                                <w:sz w:val="36"/>
+                                <w:szCs w:val="36"/>
+                                <w:lang/>
+                              </w:rPr>
+                              <w:t>"products.xml"</w:t>
+                            </w:r>
+                            <w:r>
+                              <w:rPr>
+                                <w:rFonts w:ascii="JetBrains Mono" w:hAnsi="JetBrains Mono"/>
+                                <w:color w:val="080808"/>
+                                <w:kern w:val="24"/>
+                                <w:sz w:val="36"/>
+                                <w:szCs w:val="36"/>
+                                <w:lang/>
+                              </w:rPr>
+                              <w:t>));</w:t>
+                            </w:r>
+                            <w:r>
+                              <w:rPr>
+                                <w:rFonts w:ascii="JetBrains Mono" w:hAnsi="JetBrains Mono"/>
+                                <w:color w:val="080808"/>
+                                <w:kern w:val="24"/>
+                                <w:sz w:val="36"/>
+                                <w:szCs w:val="36"/>
+                                <w:lang w:val="en-GB"/>
+                              </w:rPr>
+                              <w:t xml:space="preserve">   </w:t>
+                            </w:r>
+                            <w:r>
+                              <w:rPr>
+                                <w:rFonts w:ascii="JetBrains Mono" w:hAnsi="JetBrains Mono"/>
+                                <w:color w:val="080808"/>
+                                <w:kern w:val="24"/>
+                                <w:sz w:val="36"/>
+                                <w:szCs w:val="36"/>
+                                <w:lang/>
+                              </w:rPr>
+                              <w:br/>
+                              <w:t xml:space="preserve">    </w:t>
+                            </w:r>
+                            <w:r>
+                              <w:rPr>
+                                <w:rFonts w:ascii="JetBrains Mono" w:hAnsi="JetBrains Mono"/>
+                                <w:color w:val="000000"/>
+                                <w:kern w:val="24"/>
+                                <w:sz w:val="36"/>
+                                <w:szCs w:val="36"/>
+                                <w:lang/>
+                              </w:rPr>
+                              <w:t>out</w:t>
+                            </w:r>
+                            <w:r>
+                              <w:rPr>
+                                <w:rFonts w:ascii="JetBrains Mono" w:hAnsi="JetBrains Mono"/>
+                                <w:color w:val="080808"/>
+                                <w:kern w:val="24"/>
+                                <w:sz w:val="36"/>
+                                <w:szCs w:val="36"/>
+                                <w:lang/>
+                              </w:rPr>
+                              <w:t>.writeObject(</w:t>
+                            </w:r>
+                            <w:r>
+                              <w:rPr>
+                                <w:rFonts w:ascii="JetBrains Mono" w:hAnsi="JetBrains Mono"/>
+                                <w:color w:val="871094"/>
+                                <w:kern w:val="24"/>
+                                <w:sz w:val="36"/>
+                                <w:szCs w:val="36"/>
+                                <w:lang/>
+                              </w:rPr>
+                              <w:t>products</w:t>
+                            </w:r>
+                            <w:r>
+                              <w:rPr>
+                                <w:rFonts w:ascii="JetBrains Mono" w:hAnsi="JetBrains Mono"/>
+                                <w:color w:val="080808"/>
+                                <w:kern w:val="24"/>
+                                <w:sz w:val="36"/>
+                                <w:szCs w:val="36"/>
+                                <w:lang/>
+                              </w:rPr>
+                              <w:t>);</w:t>
+                            </w:r>
+                            <w:r>
+                              <w:rPr>
+                                <w:rFonts w:ascii="JetBrains Mono" w:hAnsi="JetBrains Mono"/>
+                                <w:color w:val="080808"/>
+                                <w:kern w:val="24"/>
+                                <w:sz w:val="36"/>
+                                <w:szCs w:val="36"/>
+                                <w:lang w:val="en-GB"/>
+                              </w:rPr>
+                              <w:t xml:space="preserve">    </w:t>
+                            </w:r>
+                            <w:r>
+                              <w:rPr>
+                                <w:rFonts w:ascii="JetBrains Mono" w:hAnsi="JetBrains Mono"/>
+                                <w:color w:val="080808"/>
+                                <w:kern w:val="24"/>
+                                <w:sz w:val="36"/>
+                                <w:szCs w:val="36"/>
+                                <w:lang/>
+                              </w:rPr>
+                              <w:br/>
+                              <w:t xml:space="preserve">    </w:t>
+                            </w:r>
+                            <w:r>
+                              <w:rPr>
+                                <w:rFonts w:ascii="JetBrains Mono" w:hAnsi="JetBrains Mono"/>
+                                <w:color w:val="000000"/>
+                                <w:kern w:val="24"/>
+                                <w:sz w:val="36"/>
+                                <w:szCs w:val="36"/>
+                                <w:lang/>
+                              </w:rPr>
+                              <w:t>out</w:t>
+                            </w:r>
+                            <w:r>
+                              <w:rPr>
+                                <w:rFonts w:ascii="JetBrains Mono" w:hAnsi="JetBrains Mono"/>
+                                <w:color w:val="080808"/>
+                                <w:kern w:val="24"/>
+                                <w:sz w:val="36"/>
+                                <w:szCs w:val="36"/>
+                                <w:lang/>
+                              </w:rPr>
+                              <w:t>.close();</w:t>
+                            </w:r>
+                            <w:r>
+                              <w:rPr>
+                                <w:rFonts w:ascii="JetBrains Mono" w:hAnsi="JetBrains Mono"/>
+                                <w:color w:val="080808"/>
+                                <w:kern w:val="24"/>
+                                <w:sz w:val="36"/>
+                                <w:szCs w:val="36"/>
+                                <w:lang w:val="en-GB"/>
+                              </w:rPr>
+                              <w:t xml:space="preserve">      </w:t>
+                            </w:r>
+                            <w:r>
+                              <w:rPr>
+                                <w:rFonts w:ascii="JetBrains Mono" w:hAnsi="JetBrains Mono"/>
+                                <w:color w:val="080808"/>
+                                <w:kern w:val="24"/>
+                                <w:sz w:val="36"/>
+                                <w:szCs w:val="36"/>
+                                <w:lang/>
+                              </w:rPr>
+                              <w:br/>
+                              <w:t>}</w:t>
+                            </w:r>
+                          </w:p>
+                        </w:txbxContent>
+                      </wps:txbx>
+                      <wps:bodyPr vert="horz" wrap="none" lIns="91440" tIns="45720" rIns="91440" bIns="45720" numCol="1" anchor="ctr" anchorCtr="0" compatLnSpc="1">
+                        <a:prstTxWarp prst="textNoShape">
+                          <a:avLst/>
+                        </a:prstTxWarp>
+                        <a:spAutoFit/>
+                      </wps:bodyPr>
+                    </wps:wsp>
+                  </a:graphicData>
+                </a:graphic>
+              </wp:anchor>
+            </w:drawing>
+          </mc:Choice>
+          <mc:Fallback>
+            <w:pict>
+              <v:rect w14:anchorId="7CA880FE" id="Rectangle 1" o:spid="_x0000_s1026" style="position:absolute;margin-left:31.2pt;margin-top:12.8pt;width:683.65pt;height:159.95pt;z-index:251659264;visibility:visible;mso-wrap-style:none;mso-wrap-distance-left:9pt;mso-wrap-distance-top:0;mso-wrap-distance-right:9pt;mso-wrap-distance-bottom:0;mso-position-horizontal:absolute;mso-position-horizontal-relative:text;mso-position-vertical:absolute;mso-position-vertical-relative:text;v-text-anchor:middle" o:gfxdata="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" fillcolor="white [3201]" strokecolor="#156082 [3204]" strokeweight="1.5pt">
+                <v:textbox style="mso-fit-shape-to-text:t">
+                  <w:txbxContent>
+                    <w:p>
+                      <w:pPr>
+                        <w:kinsoku w:val="0"/>
+                        <w:overflowPunct w:val="0"/>
+                        <w:textAlignment w:val="baseline"/>
+                        <w:rPr>
+                          <w:rFonts w:ascii="JetBrains Mono" w:hAnsi="JetBrains Mono"/>
+                          <w:color w:val="0033B3"/>
+                          <w:kern w:val="24"/>
+                          <w:sz w:val="36"/>
+                          <w:szCs w:val="36"/>
+                          <w:lang/>
+                          <w14:ligatures w14:val="none"/>
+                        </w:rPr>
+                      </w:pPr>
+                      <w:r>
+                        <w:rPr>
+                          <w:rFonts w:ascii="JetBrains Mono" w:hAnsi="JetBrains Mono"/>
+                          <w:color w:val="0033B3"/>
+                          <w:kern w:val="24"/>
+                          <w:sz w:val="36"/>
+                          <w:szCs w:val="36"/>
+                          <w:lang/>
+                        </w:rPr>
+                        <w:t xml:space="preserve">public void </w:t>
+                      </w:r>
+                      <w:r>
+                        <w:rPr>
+                          <w:rFonts w:ascii="JetBrains Mono" w:hAnsi="JetBrains Mono"/>
+                          <w:color w:val="00627A"/>
+                          <w:kern w:val="24"/>
+                          <w:sz w:val="36"/>
+                          <w:szCs w:val="36"/>
+                          <w:lang/>
+                        </w:rPr>
+                        <w:t>save</w:t>
+                      </w:r>
+                      <w:r>
+                        <w:rPr>
+                          <w:rFonts w:ascii="JetBrains Mono" w:hAnsi="JetBrains Mono"/>
+                          <w:color w:val="080808"/>
+                          <w:kern w:val="24"/>
+                          <w:sz w:val="36"/>
+                          <w:szCs w:val="36"/>
+                          <w:lang/>
+                        </w:rPr>
+                        <w:t xml:space="preserve">() </w:t>
+                      </w:r>
+                      <w:r>
+                        <w:rPr>
+                          <w:rFonts w:ascii="JetBrains Mono" w:hAnsi="JetBrains Mono"/>
+                          <w:color w:val="0033B3"/>
+                          <w:kern w:val="24"/>
+                          <w:sz w:val="36"/>
+                          <w:szCs w:val="36"/>
+                          <w:lang/>
+                        </w:rPr>
+                        <w:t xml:space="preserve">throws </w:t>
+                      </w:r>
+                      <w:r>
+                        <w:rPr>
+                          <w:rFonts w:ascii="JetBrains Mono" w:hAnsi="JetBrains Mono"/>
+                          <w:color w:val="000000"/>
+                          <w:kern w:val="24"/>
+                          <w:sz w:val="36"/>
+                          <w:szCs w:val="36"/>
+                          <w:lang/>
+                        </w:rPr>
+                        <w:t xml:space="preserve">Exception </w:t>
+                      </w:r>
+                      <w:r>
+                        <w:rPr>
+                          <w:rFonts w:ascii="JetBrains Mono" w:hAnsi="JetBrains Mono"/>
+                          <w:color w:val="080808"/>
+                          <w:kern w:val="24"/>
+                          <w:sz w:val="36"/>
+                          <w:szCs w:val="36"/>
+                          <w:lang/>
+                        </w:rPr>
+                        <w:t>{</w:t>
+                      </w:r>
+                      <w:r>
+                        <w:rPr>
+                          <w:rFonts w:ascii="JetBrains Mono" w:hAnsi="JetBrains Mono"/>
+                          <w:color w:val="080808"/>
+                          <w:kern w:val="24"/>
+                          <w:sz w:val="36"/>
+                          <w:szCs w:val="36"/>
+                          <w:lang/>
+                        </w:rPr>
+                        <w:br/>
+                        <w:t xml:space="preserve">    </w:t>
+                      </w:r>
+                      <w:r>
+                        <w:rPr>
+                          <w:rFonts w:ascii="JetBrains Mono" w:hAnsi="JetBrains Mono"/>
+                          <w:color w:val="000000"/>
+                          <w:kern w:val="24"/>
+                          <w:sz w:val="36"/>
+                          <w:szCs w:val="36"/>
+                          <w:lang/>
+                        </w:rPr>
+                        <w:t xml:space="preserve">XStream xstream </w:t>
+                      </w:r>
+                      <w:r>
+                        <w:rPr>
+                          <w:rFonts w:ascii="JetBrains Mono" w:hAnsi="JetBrains Mono"/>
+                          <w:color w:val="080808"/>
+                          <w:kern w:val="24"/>
+                          <w:sz w:val="36"/>
+                          <w:szCs w:val="36"/>
+                          <w:lang/>
+                        </w:rPr>
+                        <w:t xml:space="preserve">= </w:t>
+                      </w:r>
+                      <w:r>
+                        <w:rPr>
+                          <w:rFonts w:ascii="JetBrains Mono" w:hAnsi="JetBrains Mono"/>
+                          <w:color w:val="0033B3"/>
+                          <w:kern w:val="24"/>
+                          <w:sz w:val="36"/>
+                          <w:szCs w:val="36"/>
+                          <w:lang/>
+                        </w:rPr>
+                        <w:t xml:space="preserve">new </w:t>
+                      </w:r>
+                      <w:r>
+                        <w:rPr>
+                          <w:rFonts w:ascii="JetBrains Mono" w:hAnsi="JetBrains Mono"/>
+                          <w:color w:val="080808"/>
+                          <w:kern w:val="24"/>
+                          <w:sz w:val="36"/>
+                          <w:szCs w:val="36"/>
+                          <w:lang/>
+                        </w:rPr>
+                        <w:t>XStream(</w:t>
+                      </w:r>
+                      <w:r>
+                        <w:rPr>
+                          <w:rFonts w:ascii="JetBrains Mono" w:hAnsi="JetBrains Mono"/>
+                          <w:color w:val="0033B3"/>
+                          <w:kern w:val="24"/>
+                          <w:sz w:val="36"/>
+                          <w:szCs w:val="36"/>
+                          <w:lang/>
+                        </w:rPr>
+                        <w:t xml:space="preserve">new </w:t>
+                      </w:r>
+                      <w:r>
+                        <w:rPr>
+                          <w:rFonts w:ascii="JetBrains Mono" w:hAnsi="JetBrains Mono"/>
+                          <w:color w:val="080808"/>
+                          <w:kern w:val="24"/>
+                          <w:sz w:val="36"/>
+                          <w:szCs w:val="36"/>
+                          <w:lang/>
+                        </w:rPr>
+                        <w:t>DomDriver());</w:t>
+                      </w:r>
+                      <w:r>
+                        <w:rPr>
+                          <w:rFonts w:ascii="JetBrains Mono" w:hAnsi="JetBrains Mono"/>
+                          <w:color w:val="080808"/>
+                          <w:kern w:val="24"/>
+                          <w:sz w:val="36"/>
+                          <w:szCs w:val="36"/>
+                          <w:lang w:val="en-GB"/>
+                        </w:rPr>
+                        <w:t xml:space="preserve">    </w:t>
+                      </w:r>
+                      <w:r>
+                        <w:rPr>
+                          <w:rFonts w:ascii="JetBrains Mono" w:hAnsi="JetBrains Mono"/>
+                          <w:color w:val="080808"/>
+                          <w:kern w:val="24"/>
+                          <w:sz w:val="36"/>
+                          <w:szCs w:val="36"/>
+                          <w:lang/>
+                        </w:rPr>
+                        <w:br/>
+                        <w:t xml:space="preserve">    </w:t>
+                      </w:r>
+                      <w:r>
+                        <w:rPr>
+                          <w:rFonts w:ascii="JetBrains Mono" w:hAnsi="JetBrains Mono"/>
+                          <w:color w:val="000000"/>
+                          <w:kern w:val="24"/>
+                          <w:sz w:val="36"/>
+                          <w:szCs w:val="36"/>
+                          <w:lang/>
+                        </w:rPr>
+                        <w:t xml:space="preserve">ObjectOutputStream out </w:t>
+                      </w:r>
+                      <w:r>
+                        <w:rPr>
+                          <w:rFonts w:ascii="JetBrains Mono" w:hAnsi="JetBrains Mono"/>
+                          <w:color w:val="080808"/>
+                          <w:kern w:val="24"/>
+                          <w:sz w:val="36"/>
+                          <w:szCs w:val="36"/>
+                          <w:lang/>
+                        </w:rPr>
+                        <w:t xml:space="preserve">= </w:t>
+                      </w:r>
+                    </w:p>
+                    <w:p>
+                      <w:pPr>
+                        <w:kinsoku w:val="0"/>
+                        <w:overflowPunct w:val="0"/>
+                        <w:textAlignment w:val="baseline"/>
+                        <w:rPr>
+                          <w:rFonts w:ascii="JetBrains Mono" w:hAnsi="JetBrains Mono"/>
+                          <w:color w:val="080808"/>
+                          <w:kern w:val="24"/>
+                          <w:sz w:val="36"/>
+                          <w:szCs w:val="36"/>
+                          <w:lang w:val="en-GB"/>
+                        </w:rPr>
+                      </w:pPr>
+                      <w:r>
+                        <w:rPr>
+                          <w:rFonts w:ascii="JetBrains Mono" w:hAnsi="JetBrains Mono"/>
+                          <w:color w:val="080808"/>
+                          <w:kern w:val="24"/>
+                          <w:sz w:val="36"/>
+                          <w:szCs w:val="36"/>
+                          <w:lang w:val="en-GB"/>
+                        </w:rPr>
+                        <w:tab/>
+                      </w:r>
+                      <w:r>
+                        <w:rPr>
+                          <w:rFonts w:ascii="JetBrains Mono" w:hAnsi="JetBrains Mono"/>
+                          <w:color w:val="080808"/>
+                          <w:kern w:val="24"/>
+                          <w:sz w:val="36"/>
+                          <w:szCs w:val="36"/>
+                          <w:lang w:val="en-GB"/>
+                        </w:rPr>
+                        <w:tab/>
+                      </w:r>
+                      <w:r>
+                        <w:rPr>
+                          <w:rFonts w:ascii="JetBrains Mono" w:hAnsi="JetBrains Mono"/>
+                          <w:color w:val="000000"/>
+                          <w:kern w:val="24"/>
+                          <w:sz w:val="36"/>
+                          <w:szCs w:val="36"/>
+                          <w:lang/>
+                        </w:rPr>
+                        <w:t>xstream</w:t>
+                      </w:r>
+                      <w:r>
+                        <w:rPr>
+                          <w:rFonts w:ascii="JetBrains Mono" w:hAnsi="JetBrains Mono"/>
+                          <w:color w:val="080808"/>
+                          <w:kern w:val="24"/>
+                          <w:sz w:val="36"/>
+                          <w:szCs w:val="36"/>
+                          <w:lang/>
+                        </w:rPr>
+                        <w:t>.createObjectOutputStream(</w:t>
+                      </w:r>
+                      <w:r>
+                        <w:rPr>
+                          <w:rFonts w:ascii="JetBrains Mono" w:hAnsi="JetBrains Mono"/>
+                          <w:color w:val="0033B3"/>
+                          <w:kern w:val="24"/>
+                          <w:sz w:val="36"/>
+                          <w:szCs w:val="36"/>
+                          <w:lang/>
+                        </w:rPr>
+                        <w:t xml:space="preserve">new </w:t>
+                      </w:r>
+                      <w:r>
+                        <w:rPr>
+                          <w:rFonts w:ascii="JetBrains Mono" w:hAnsi="JetBrains Mono"/>
+                          <w:color w:val="080808"/>
+                          <w:kern w:val="24"/>
+                          <w:sz w:val="36"/>
+                          <w:szCs w:val="36"/>
+                          <w:lang/>
+                        </w:rPr>
+                        <w:t>FileWriter(</w:t>
+                      </w:r>
+                      <w:r>
+                        <w:rPr>
+                          <w:rFonts w:ascii="JetBrains Mono" w:hAnsi="JetBrains Mono"/>
+                          <w:color w:val="067D17"/>
+                          <w:kern w:val="24"/>
+                          <w:sz w:val="36"/>
+                          <w:szCs w:val="36"/>
+                          <w:lang/>
+                        </w:rPr>
+                        <w:t>"products.xml"</w:t>
+                      </w:r>
+                      <w:r>
+                        <w:rPr>
+                          <w:rFonts w:ascii="JetBrains Mono" w:hAnsi="JetBrains Mono"/>
+                          <w:color w:val="080808"/>
+                          <w:kern w:val="24"/>
+                          <w:sz w:val="36"/>
+                          <w:szCs w:val="36"/>
+                          <w:lang/>
+                        </w:rPr>
+                        <w:t>));</w:t>
+                      </w:r>
+                      <w:r>
+                        <w:rPr>
+                          <w:rFonts w:ascii="JetBrains Mono" w:hAnsi="JetBrains Mono"/>
+                          <w:color w:val="080808"/>
+                          <w:kern w:val="24"/>
+                          <w:sz w:val="36"/>
+                          <w:szCs w:val="36"/>
+                          <w:lang w:val="en-GB"/>
+                        </w:rPr>
+                        <w:t xml:space="preserve">   </w:t>
+                      </w:r>
+                      <w:r>
+                        <w:rPr>
+                          <w:rFonts w:ascii="JetBrains Mono" w:hAnsi="JetBrains Mono"/>
+                          <w:color w:val="080808"/>
+                          <w:kern w:val="24"/>
+                          <w:sz w:val="36"/>
+                          <w:szCs w:val="36"/>
+                          <w:lang/>
+                        </w:rPr>
+                        <w:br/>
+                        <w:t xml:space="preserve">    </w:t>
+                      </w:r>
+                      <w:r>
+                        <w:rPr>
+                          <w:rFonts w:ascii="JetBrains Mono" w:hAnsi="JetBrains Mono"/>
+                          <w:color w:val="000000"/>
+                          <w:kern w:val="24"/>
+                          <w:sz w:val="36"/>
+                          <w:szCs w:val="36"/>
+                          <w:lang/>
+                        </w:rPr>
+                        <w:t>out</w:t>
+                      </w:r>
+                      <w:r>
+                        <w:rPr>
+                          <w:rFonts w:ascii="JetBrains Mono" w:hAnsi="JetBrains Mono"/>
+                          <w:color w:val="080808"/>
+                          <w:kern w:val="24"/>
+                          <w:sz w:val="36"/>
+                          <w:szCs w:val="36"/>
+                          <w:lang/>
+                        </w:rPr>
+                        <w:t>.writeObject(</w:t>
+                      </w:r>
+                      <w:r>
+                        <w:rPr>
+                          <w:rFonts w:ascii="JetBrains Mono" w:hAnsi="JetBrains Mono"/>
+                          <w:color w:val="871094"/>
+                          <w:kern w:val="24"/>
+                          <w:sz w:val="36"/>
+                          <w:szCs w:val="36"/>
+                          <w:lang/>
+                        </w:rPr>
+                        <w:t>products</w:t>
+                      </w:r>
+                      <w:r>
+                        <w:rPr>
+                          <w:rFonts w:ascii="JetBrains Mono" w:hAnsi="JetBrains Mono"/>
+                          <w:color w:val="080808"/>
+                          <w:kern w:val="24"/>
+                          <w:sz w:val="36"/>
+                          <w:szCs w:val="36"/>
+                          <w:lang/>
+                        </w:rPr>
+                        <w:t>);</w:t>
+                      </w:r>
+                      <w:r>
+                        <w:rPr>
+                          <w:rFonts w:ascii="JetBrains Mono" w:hAnsi="JetBrains Mono"/>
+                          <w:color w:val="080808"/>
+                          <w:kern w:val="24"/>
+                          <w:sz w:val="36"/>
+                          <w:szCs w:val="36"/>
+                          <w:lang w:val="en-GB"/>
+                        </w:rPr>
+                        <w:t xml:space="preserve">    </w:t>
+                      </w:r>
+                      <w:r>
+                        <w:rPr>
+                          <w:rFonts w:ascii="JetBrains Mono" w:hAnsi="JetBrains Mono"/>
+                          <w:color w:val="080808"/>
+                          <w:kern w:val="24"/>
+                          <w:sz w:val="36"/>
+                          <w:szCs w:val="36"/>
+                          <w:lang/>
+                        </w:rPr>
+                        <w:br/>
+                        <w:t xml:space="preserve">    </w:t>
+                      </w:r>
+                      <w:r>
+                        <w:rPr>
+                          <w:rFonts w:ascii="JetBrains Mono" w:hAnsi="JetBrains Mono"/>
+                          <w:color w:val="000000"/>
+                          <w:kern w:val="24"/>
+                          <w:sz w:val="36"/>
+                          <w:szCs w:val="36"/>
+                          <w:lang/>
+                        </w:rPr>
+                        <w:t>out</w:t>
+                      </w:r>
+                      <w:r>
+                        <w:rPr>
+                          <w:rFonts w:ascii="JetBrains Mono" w:hAnsi="JetBrains Mono"/>
+                          <w:color w:val="080808"/>
+                          <w:kern w:val="24"/>
+                          <w:sz w:val="36"/>
+                          <w:szCs w:val="36"/>
+                          <w:lang/>
+                        </w:rPr>
+                        <w:t>.close();</w:t>
+                      </w:r>
+                      <w:r>
+                        <w:rPr>
+                          <w:rFonts w:ascii="JetBrains Mono" w:hAnsi="JetBrains Mono"/>
+                          <w:color w:val="080808"/>
+                          <w:kern w:val="24"/>
+                          <w:sz w:val="36"/>
+                          <w:szCs w:val="36"/>
+                          <w:lang w:val="en-GB"/>
+                        </w:rPr>
+                        <w:t xml:space="preserve">      </w:t>
+                      </w:r>
+                      <w:r>
+                        <w:rPr>
+                          <w:rFonts w:ascii="JetBrains Mono" w:hAnsi="JetBrains Mono"/>
+                          <w:color w:val="080808"/>
+                          <w:kern w:val="24"/>
+                          <w:sz w:val="36"/>
+                          <w:szCs w:val="36"/>
+                          <w:lang/>
+                        </w:rPr>
+                        <w:br/>
+                        <w:t>}</w:t>
+                      </w:r>
+                    </w:p>
+                  </w:txbxContent>
+                </v:textbox>
+              </v:rect>
+            </w:pict>
+          </mc:Fallback>
+        </mc:AlternateContent>
+      </w:r>
+    </w:p>
     <w:sectPr>
       <w:pgSz w:w="11906" w:h="16838"/>
       <w:pgMar w:top="1440" w:right="1440" w:bottom="1440" w:left="1440" w:header="708" w:footer="708" w:gutter="0"/>
@@ -1053,6 +2345,56 @@
 </w:document>
 </file>
 
+<file path=word/endnotes.xml><?xml version="1.0" encoding="utf-8"?>
+<w:endnotes xmlns:wpc="http://schemas.microsoft.com/office/word/2010/wordprocessingCanvas" xmlns:cx="http://schemas.microsoft.com/office/drawing/2014/chartex" xmlns:cx1="http://schemas.microsoft.com/office/drawing/2015/9/8/chartex" xmlns:cx2="http://schemas.microsoft.com/office/drawing/2015/10/21/chartex" xmlns:cx3="http://schemas.microsoft.com/office/drawing/2016/5/9/chartex" xmlns:cx4="http://schemas.microsoft.com/office/drawing/2016/5/10/chartex" xmlns:cx5="http://schemas.microsoft.com/office/drawing/2016/5/11/chartex" xmlns:cx6="http://schemas.microsoft.com/office/drawing/2016/5/12/chartex" xmlns:cx7="http://schemas.microsoft.com/office/drawing/2016/5/13/chartex" xmlns:cx8="http://schemas.microsoft.com/office/drawing/2016/5/14/chartex" xmlns:mc="http://schemas.openxmlformats.org/markup-compatibility/2006" xmlns:aink="http://schemas.microsoft.com/office/drawing/2016/ink" xmlns:am3d="http://schemas.microsoft.com/office/drawing/2017/model3d" xmlns:o="urn:schemas-microsoft-com:office:office" xmlns:oel="http://schemas.microsoft.com/office/2019/extlst" xmlns:r="http://schemas.openxmlformats.org/officeDocument/2006/relationships" xmlns:m="http://schemas.openxmlformats.org/officeDocument/2006/math" xmlns:v="urn:schemas-microsoft-com:vml" xmlns:wp14="http://schemas.microsoft.com/office/word/2010/wordprocessingDrawing" xmlns:wp="http://schemas.openxmlformats.org/drawingml/2006/wordprocessingDrawing" xmlns:w10="urn:schemas-microsoft-com:office:word" xmlns:w="http://schemas.openxmlformats.org/wordprocessingml/2006/main" xmlns:w14="http://schemas.microsoft.com/office/word/2010/wordml" xmlns:w15="http://schemas.microsoft.com/office/word/2012/wordml" xmlns:w16cex="http://schemas.microsoft.com/office/word/2018/wordml/cex" xmlns:w16cid="http://schemas.microsoft.com/office/word/2016/wordml/cid" xmlns:w16="http://schemas.microsoft.com/office/word/2018/wordml" xmlns:w16du="http://schemas.microsoft.com/office/word/2023/wordml/word16du" xmlns:w16sdtdh="http://schemas.microsoft.com/office/word/2020/wordml/sdtdatahash" xmlns:w16sdtfl="http://schemas.microsoft.com/office/word/2024/wordml/sdtformatlock" xmlns:w16se="http://schemas.microsoft.com/office/word/2015/wordml/symex" xmlns:wpg="http://schemas.microsoft.com/office/word/2010/wordprocessingGroup" xmlns:wpi="http://schemas.microsoft.com/office/word/2010/wordprocessingInk" xmlns:wne="http://schemas.microsoft.com/office/word/2006/wordml" xmlns:wps="http://schemas.microsoft.com/office/word/2010/wordprocessingShape" mc:Ignorable="w14 w15 w16se w16cid w16 w16cex w16sdtdh w16sdtfl w16du wp14">
+  <w:endnote w:type="separator" w:id="-1">
+    <w:p>
+      <w:pPr>
+        <w:spacing w:after="0" w:line="240" w:lineRule="auto"/>
+      </w:pPr>
+      <w:r>
+        <w:separator/>
+      </w:r>
+    </w:p>
+  </w:endnote>
+  <w:endnote w:type="continuationSeparator" w:id="0">
+    <w:p>
+      <w:pPr>
+        <w:spacing w:after="0" w:line="240" w:lineRule="auto"/>
+      </w:pPr>
+      <w:r>
+        <w:continuationSeparator/>
+      </w:r>
+    </w:p>
+  </w:endnote>
+</w:endnotes>
+</file>
+
+<file path=word/footnotes.xml><?xml version="1.0" encoding="utf-8"?>
+<w:footnotes xmlns:wpc="http://schemas.microsoft.com/office/word/2010/wordprocessingCanvas" xmlns:cx="http://schemas.microsoft.com/office/drawing/2014/chartex" xmlns:cx1="http://schemas.microsoft.com/office/drawing/2015/9/8/chartex" xmlns:cx2="http://schemas.microsoft.com/office/drawing/2015/10/21/chartex" xmlns:cx3="http://schemas.microsoft.com/office/drawing/2016/5/9/chartex" xmlns:cx4="http://schemas.microsoft.com/office/drawing/2016/5/10/chartex" xmlns:cx5="http://schemas.microsoft.com/office/drawing/2016/5/11/chartex" xmlns:cx6="http://schemas.microsoft.com/office/drawing/2016/5/12/chartex" xmlns:cx7="http://schemas.microsoft.com/office/drawing/2016/5/13/chartex" xmlns:cx8="http://schemas.microsoft.com/office/drawing/2016/5/14/chartex" xmlns:mc="http://schemas.openxmlformats.org/markup-compatibility/2006" xmlns:aink="http://schemas.microsoft.com/office/drawing/2016/ink" xmlns:am3d="http://schemas.microsoft.com/office/drawing/2017/model3d" xmlns:o="urn:schemas-microsoft-com:office:office" xmlns:oel="http://schemas.microsoft.com/office/2019/extlst" xmlns:r="http://schemas.openxmlformats.org/officeDocument/2006/relationships" xmlns:m="http://schemas.openxmlformats.org/officeDocument/2006/math" xmlns:v="urn:schemas-microsoft-com:vml" xmlns:wp14="http://schemas.microsoft.com/office/word/2010/wordprocessingDrawing" xmlns:wp="http://schemas.openxmlformats.org/drawingml/2006/wordprocessingDrawing" xmlns:w10="urn:schemas-microsoft-com:office:word" xmlns:w="http://schemas.openxmlformats.org/wordprocessingml/2006/main" xmlns:w14="http://schemas.microsoft.com/office/word/2010/wordml" xmlns:w15="http://schemas.microsoft.com/office/word/2012/wordml" xmlns:w16cex="http://schemas.microsoft.com/office/word/2018/wordml/cex" xmlns:w16cid="http://schemas.microsoft.com/office/word/2016/wordml/cid" xmlns:w16="http://schemas.microsoft.com/office/word/2018/wordml" xmlns:w16du="http://schemas.microsoft.com/office/word/2023/wordml/word16du" xmlns:w16sdtdh="http://schemas.microsoft.com/office/word/2020/wordml/sdtdatahash" xmlns:w16sdtfl="http://schemas.microsoft.com/office/word/2024/wordml/sdtformatlock" xmlns:w16se="http://schemas.microsoft.com/office/word/2015/wordml/symex" xmlns:wpg="http://schemas.microsoft.com/office/word/2010/wordprocessingGroup" xmlns:wpi="http://schemas.microsoft.com/office/word/2010/wordprocessingInk" xmlns:wne="http://schemas.microsoft.com/office/word/2006/wordml" xmlns:wps="http://schemas.microsoft.com/office/word/2010/wordprocessingShape" mc:Ignorable="w14 w15 w16se w16cid w16 w16cex w16sdtdh w16sdtfl w16du wp14">
+  <w:footnote w:type="separator" w:id="-1">
+    <w:p>
+      <w:pPr>
+        <w:spacing w:after="0" w:line="240" w:lineRule="auto"/>
+      </w:pPr>
+      <w:r>
+        <w:separator/>
+      </w:r>
+    </w:p>
+  </w:footnote>
+  <w:footnote w:type="continuationSeparator" w:id="0">
+    <w:p>
+      <w:pPr>
+        <w:spacing w:after="0" w:line="240" w:lineRule="auto"/>
+      </w:pPr>
+      <w:r>
+        <w:continuationSeparator/>
+      </w:r>
+    </w:p>
+  </w:footnote>
+</w:footnotes>
+</file>
+
 <file path=word/numbering.xml><?xml version="1.0" encoding="utf-8"?>
 <w:numbering xmlns:wpc="http://schemas.microsoft.com/office/word/2010/wordprocessingCanvas" xmlns:cx="http://schemas.microsoft.com/office/drawing/2014/chartex" xmlns:cx1="http://schemas.microsoft.com/office/drawing/2015/9/8/chartex" xmlns:cx2="http://schemas.microsoft.com/office/drawing/2015/10/21/chartex" xmlns:cx3="http://schemas.microsoft.com/office/drawing/2016/5/9/chartex" xmlns:cx4="http://schemas.microsoft.com/office/drawing/2016/5/10/chartex" xmlns:cx5="http://schemas.microsoft.com/office/drawing/2016/5/11/chartex" xmlns:cx6="http://schemas.microsoft.com/office/drawing/2016/5/12/chartex" xmlns:cx7="http://schemas.microsoft.com/office/drawing/2016/5/13/chartex" xmlns:cx8="http://schemas.microsoft.com/office/drawing/2016/5/14/chartex" xmlns:mc="http://schemas.openxmlformats.org/markup-compatibility/2006" xmlns:aink="http://schemas.microsoft.com/office/drawing/2016/ink" xmlns:am3d="http://schemas.microsoft.com/office/drawing/2017/model3d" xmlns:o="urn:schemas-microsoft-com:office:office" xmlns:oel="http://schemas.microsoft.com/office/2019/extlst" xmlns:r="http://schemas.openxmlformats.org/officeDocument/2006/relationships" xmlns:m="http://schemas.openxmlformats.org/officeDocument/2006/math" xmlns:v="urn:schemas-microsoft-com:vml" xmlns:wp14="http://schemas.microsoft.com/office/word/2010/wordprocessingDrawing" xmlns:wp="http://schemas.openxmlformats.org/drawingml/2006/wordprocessingDrawing" xmlns:w10="urn:schemas-microsoft-com:office:word" xmlns:w="http://schemas.openxmlformats.org/wordprocessingml/2006/main" xmlns:w14="http://schemas.microsoft.com/office/word/2010/wordml" xmlns:w15="http://schemas.microsoft.com/office/word/2012/wordml" xmlns:w16cex="http://schemas.microsoft.com/office/word/2018/wordml/cex" xmlns:w16cid="http://schemas.microsoft.com/office/word/2016/wordml/cid" xmlns:w16="http://schemas.microsoft.com/office/word/2018/wordml" xmlns:w16du="http://schemas.microsoft.com/office/word/2023/wordml/word16du" xmlns:w16sdtdh="http://schemas.microsoft.com/office/word/2020/wordml/sdtdatahash" xmlns:w16sdtfl="http://schemas.microsoft.com/office/word/2024/wordml/sdtformatlock" xmlns:w16se="http://schemas.microsoft.com/office/word/2015/wordml/symex" xmlns:wpg="http://schemas.microsoft.com/office/word/2010/wordprocessingGroup" xmlns:wpi="http://schemas.microsoft.com/office/word/2010/wordprocessingInk" xmlns:wne="http://schemas.microsoft.com/office/word/2006/wordml" xmlns:wps="http://schemas.microsoft.com/office/word/2010/wordprocessingShape" mc:Ignorable="w14 w15 w16se w16cid w16 w16cex w16sdtdh w16sdtfl w16du wp14">
   <w:abstractNum w:abstractNumId="0" w15:restartNumberingAfterBreak="0">
@@ -2109,6 +3451,92 @@
     </w:lvl>
   </w:abstractNum>
   <w:abstractNum w:abstractNumId="9" w15:restartNumberingAfterBreak="0">
+    <w:nsid w:val="5B4A60BF"/>
+    <w:multiLevelType w:val="hybridMultilevel"/>
+    <w:tmpl w:val="92646CA0"/>
+    <w:lvl w:ilvl="0" w:tplc="1809000F">
+      <w:start w:val="1"/>
+      <w:numFmt w:val="decimal"/>
+      <w:lvlText w:val="%1."/>
+      <w:lvlJc w:val="left"/>
+      <w:pPr>
+        <w:ind w:left="720" w:hanging="360"/>
+      </w:pPr>
+    </w:lvl>
+    <w:lvl w:ilvl="1" w:tplc="18090019" w:tentative="1">
+      <w:start w:val="1"/>
+      <w:numFmt w:val="lowerLetter"/>
+      <w:lvlText w:val="%2."/>
+      <w:lvlJc w:val="left"/>
+      <w:pPr>
+        <w:ind w:left="1440" w:hanging="360"/>
+      </w:pPr>
+    </w:lvl>
+    <w:lvl w:ilvl="2" w:tplc="1809001B" w:tentative="1">
+      <w:start w:val="1"/>
+      <w:numFmt w:val="lowerRoman"/>
+      <w:lvlText w:val="%3."/>
+      <w:lvlJc w:val="right"/>
+      <w:pPr>
+        <w:ind w:left="2160" w:hanging="180"/>
+      </w:pPr>
+    </w:lvl>
+    <w:lvl w:ilvl="3" w:tplc="1809000F" w:tentative="1">
+      <w:start w:val="1"/>
+      <w:numFmt w:val="decimal"/>
+      <w:lvlText w:val="%4."/>
+      <w:lvlJc w:val="left"/>
+      <w:pPr>
+        <w:ind w:left="2880" w:hanging="360"/>
+      </w:pPr>
+    </w:lvl>
+    <w:lvl w:ilvl="4" w:tplc="18090019" w:tentative="1">
+      <w:start w:val="1"/>
+      <w:numFmt w:val="lowerLetter"/>
+      <w:lvlText w:val="%5."/>
+      <w:lvlJc w:val="left"/>
+      <w:pPr>
+        <w:ind w:left="3600" w:hanging="360"/>
+      </w:pPr>
+    </w:lvl>
+    <w:lvl w:ilvl="5" w:tplc="1809001B" w:tentative="1">
+      <w:start w:val="1"/>
+      <w:numFmt w:val="lowerRoman"/>
+      <w:lvlText w:val="%6."/>
+      <w:lvlJc w:val="right"/>
+      <w:pPr>
+        <w:ind w:left="4320" w:hanging="180"/>
+      </w:pPr>
+    </w:lvl>
+    <w:lvl w:ilvl="6" w:tplc="1809000F" w:tentative="1">
+      <w:start w:val="1"/>
+      <w:numFmt w:val="decimal"/>
+      <w:lvlText w:val="%7."/>
+      <w:lvlJc w:val="left"/>
+      <w:pPr>
+        <w:ind w:left="5040" w:hanging="360"/>
+      </w:pPr>
+    </w:lvl>
+    <w:lvl w:ilvl="7" w:tplc="18090019" w:tentative="1">
+      <w:start w:val="1"/>
+      <w:numFmt w:val="lowerLetter"/>
+      <w:lvlText w:val="%8."/>
+      <w:lvlJc w:val="left"/>
+      <w:pPr>
+        <w:ind w:left="5760" w:hanging="360"/>
+      </w:pPr>
+    </w:lvl>
+    <w:lvl w:ilvl="8" w:tplc="1809001B" w:tentative="1">
+      <w:start w:val="1"/>
+      <w:numFmt w:val="lowerRoman"/>
+      <w:lvlText w:val="%9."/>
+      <w:lvlJc w:val="right"/>
+      <w:pPr>
+        <w:ind w:left="6480" w:hanging="180"/>
+      </w:pPr>
+    </w:lvl>
+  </w:abstractNum>
+  <w:abstractNum w:abstractNumId="10" w15:restartNumberingAfterBreak="0">
     <w:nsid w:val="69CE62A1"/>
     <w:multiLevelType w:val="multilevel"/>
     <w:tmpl w:val="077EE204"/>
@@ -2221,7 +3649,7 @@
       </w:pPr>
     </w:lvl>
   </w:abstractNum>
-  <w:abstractNum w:abstractNumId="10" w15:restartNumberingAfterBreak="0">
+  <w:abstractNum w:abstractNumId="11" w15:restartNumberingAfterBreak="0">
     <w:nsid w:val="6A520961"/>
     <w:multiLevelType w:val="multilevel"/>
     <w:tmpl w:val="F7AC3FF8"/>
@@ -2334,7 +3762,7 @@
       </w:pPr>
     </w:lvl>
   </w:abstractNum>
-  <w:abstractNum w:abstractNumId="11" w15:restartNumberingAfterBreak="0">
+  <w:abstractNum w:abstractNumId="12" w15:restartNumberingAfterBreak="0">
     <w:nsid w:val="7FFD55AB"/>
     <w:multiLevelType w:val="multilevel"/>
     <w:tmpl w:val="9C5CF79E"/>
@@ -2496,7 +3924,7 @@
     <w:abstractNumId w:val="3"/>
   </w:num>
   <w:num w:numId="5" w16cid:durableId="789128191">
-    <w:abstractNumId w:val="9"/>
+    <w:abstractNumId w:val="10"/>
   </w:num>
   <w:num w:numId="6" w16cid:durableId="1549104559">
     <w:abstractNumId w:val="2"/>
@@ -2505,19 +3933,22 @@
     <w:abstractNumId w:val="1"/>
   </w:num>
   <w:num w:numId="8" w16cid:durableId="281890174">
-    <w:abstractNumId w:val="11"/>
+    <w:abstractNumId w:val="12"/>
   </w:num>
   <w:num w:numId="9" w16cid:durableId="1940289586">
     <w:abstractNumId w:val="5"/>
   </w:num>
   <w:num w:numId="10" w16cid:durableId="817234038">
-    <w:abstractNumId w:val="10"/>
+    <w:abstractNumId w:val="11"/>
   </w:num>
   <w:num w:numId="11" w16cid:durableId="389962416">
     <w:abstractNumId w:val="6"/>
   </w:num>
   <w:num w:numId="12" w16cid:durableId="2056733656">
     <w:abstractNumId w:val="8"/>
+  </w:num>
+  <w:num w:numId="13" w16cid:durableId="2090733924">
+    <w:abstractNumId w:val="9"/>
   </w:num>
 </w:numbering>
 </file>
@@ -3438,6 +4869,50 @@
       <w:spacing w:val="5"/>
     </w:rPr>
   </w:style>
+  <w:style w:type="paragraph" w:styleId="Header">
+    <w:name w:val="header"/>
+    <w:basedOn w:val="Normal"/>
+    <w:link w:val="HeaderChar"/>
+    <w:uiPriority w:val="99"/>
+    <w:unhideWhenUsed/>
+    <w:rsid w:val="00177B53"/>
+    <w:pPr>
+      <w:tabs>
+        <w:tab w:val="center" w:pos="4513"/>
+        <w:tab w:val="right" w:pos="9026"/>
+      </w:tabs>
+      <w:spacing w:after="0" w:line="240" w:lineRule="auto"/>
+    </w:pPr>
+  </w:style>
+  <w:style w:type="character" w:customStyle="1" w:styleId="HeaderChar">
+    <w:name w:val="Header Char"/>
+    <w:basedOn w:val="DefaultParagraphFont"/>
+    <w:link w:val="Header"/>
+    <w:uiPriority w:val="99"/>
+    <w:rsid w:val="00177B53"/>
+  </w:style>
+  <w:style w:type="paragraph" w:styleId="Footer">
+    <w:name w:val="footer"/>
+    <w:basedOn w:val="Normal"/>
+    <w:link w:val="FooterChar"/>
+    <w:uiPriority w:val="99"/>
+    <w:unhideWhenUsed/>
+    <w:rsid w:val="00177B53"/>
+    <w:pPr>
+      <w:tabs>
+        <w:tab w:val="center" w:pos="4513"/>
+        <w:tab w:val="right" w:pos="9026"/>
+      </w:tabs>
+      <w:spacing w:after="0" w:line="240" w:lineRule="auto"/>
+    </w:pPr>
+  </w:style>
+  <w:style w:type="character" w:customStyle="1" w:styleId="FooterChar">
+    <w:name w:val="Footer Char"/>
+    <w:basedOn w:val="DefaultParagraphFont"/>
+    <w:link w:val="Footer"/>
+    <w:uiPriority w:val="99"/>
+    <w:rsid w:val="00177B53"/>
+  </w:style>
 </w:styles>
 </file>
 

</xml_diff>